<commit_message>
Submission prep: title page, added simulation data, updated main README
</commit_message>
<xml_diff>
--- a/drafts/paRsynth_methods_titlepage.docx
+++ b/drafts/paRsynth_methods_titlepage.docx
@@ -8,8 +8,6 @@
           <w:rFonts w:ascii="Arial" w:hAnsi="Arial" w:cs="Arial"/>
         </w:rPr>
       </w:pPr>
-      <w:commentRangeStart w:id="0"/>
-      <w:commentRangeStart w:id="1"/>
       <w:r>
         <w:rPr>
           <w:rFonts w:ascii="Arial" w:hAnsi="Arial" w:cs="Arial"/>
@@ -18,20 +16,6 @@
         </w:rPr>
         <w:t>Title</w:t>
       </w:r>
-      <w:commentRangeEnd w:id="0"/>
-      <w:r>
-        <w:rPr>
-          <w:rStyle w:val="CommentReference"/>
-        </w:rPr>
-        <w:commentReference w:id="0"/>
-      </w:r>
-      <w:commentRangeEnd w:id="1"/>
-      <w:r>
-        <w:rPr>
-          <w:rStyle w:val="CommentReference"/>
-        </w:rPr>
-        <w:commentReference w:id="1"/>
-      </w:r>
       <w:r>
         <w:rPr>
           <w:rFonts w:ascii="Arial" w:hAnsi="Arial" w:cs="Arial"/>
@@ -42,7 +26,19 @@
         <w:rPr>
           <w:rFonts w:ascii="Arial" w:hAnsi="Arial" w:cs="Arial"/>
         </w:rPr>
-        <w:t xml:space="preserve"> Synthetic frequency-modulated vocalizations to test identity information detection </w:t>
+        <w:t xml:space="preserve"> </w:t>
+      </w:r>
+      <w:r>
+        <w:rPr>
+          <w:rFonts w:ascii="Arial" w:hAnsi="Arial" w:cs="Arial"/>
+        </w:rPr>
+        <w:t>Testing identity information detection with s</w:t>
+      </w:r>
+      <w:r>
+        <w:rPr>
+          <w:rFonts w:ascii="Arial" w:hAnsi="Arial" w:cs="Arial"/>
+        </w:rPr>
+        <w:t>ynthetic frequency-modulated vocalizations</w:t>
       </w:r>
     </w:p>
     <w:p>
@@ -420,25 +416,7 @@
           <w:sz w:val="24"/>
           <w:szCs w:val="24"/>
         </w:rPr>
-        <w:t xml:space="preserve">, </w:t>
-      </w:r>
-      <w:proofErr w:type="spellStart"/>
-      <w:r>
-        <w:rPr>
-          <w:rFonts w:ascii="Arial" w:hAnsi="Arial" w:cs="Arial"/>
-          <w:sz w:val="24"/>
-          <w:szCs w:val="24"/>
-        </w:rPr>
-        <w:t>Northhampton</w:t>
-      </w:r>
-      <w:proofErr w:type="spellEnd"/>
-      <w:r>
-        <w:rPr>
-          <w:rFonts w:ascii="Arial" w:hAnsi="Arial" w:cs="Arial"/>
-          <w:sz w:val="24"/>
-          <w:szCs w:val="24"/>
-        </w:rPr>
-        <w:t>, MA, USA</w:t>
+        <w:t>, Northhampton, MA, USA</w:t>
       </w:r>
     </w:p>
     <w:p>
@@ -489,25 +467,7 @@
           <w:sz w:val="24"/>
           <w:szCs w:val="24"/>
         </w:rPr>
-        <w:t xml:space="preserve">, </w:t>
-      </w:r>
-      <w:proofErr w:type="spellStart"/>
-      <w:r>
-        <w:rPr>
-          <w:rFonts w:ascii="Arial" w:hAnsi="Arial" w:cs="Arial"/>
-          <w:sz w:val="24"/>
-          <w:szCs w:val="24"/>
-        </w:rPr>
-        <w:t>Northhampton</w:t>
-      </w:r>
-      <w:proofErr w:type="spellEnd"/>
-      <w:r>
-        <w:rPr>
-          <w:rFonts w:ascii="Arial" w:hAnsi="Arial" w:cs="Arial"/>
-          <w:sz w:val="24"/>
-          <w:szCs w:val="24"/>
-        </w:rPr>
-        <w:t>, MA, USA</w:t>
+        <w:t>, Northhampton, MA, USA</w:t>
       </w:r>
     </w:p>
     <w:p>
@@ -710,23 +670,7 @@
           <w:rFonts w:ascii="Arial" w:hAnsi="Arial" w:cs="Arial"/>
           <w:color w:val="000000" w:themeColor="text1"/>
         </w:rPr>
-        <w:t xml:space="preserve"> </w:t>
-      </w:r>
-      <w:proofErr w:type="gramStart"/>
-      <w:r>
-        <w:rPr>
-          <w:rFonts w:ascii="Arial" w:hAnsi="Arial" w:cs="Arial"/>
-          <w:color w:val="000000" w:themeColor="text1"/>
-        </w:rPr>
-        <w:t>equal</w:t>
-      </w:r>
-      <w:proofErr w:type="gramEnd"/>
-      <w:r>
-        <w:rPr>
-          <w:rFonts w:ascii="Arial" w:hAnsi="Arial" w:cs="Arial"/>
-          <w:color w:val="000000" w:themeColor="text1"/>
-        </w:rPr>
-        <w:t xml:space="preserve"> contributions</w:t>
+        <w:t>equal contributions</w:t>
       </w:r>
     </w:p>
     <w:p>
@@ -758,7 +702,7 @@
           <w:rFonts w:ascii="Arial" w:hAnsi="Arial" w:cs="Arial"/>
           <w:color w:val="000000" w:themeColor="text1"/>
         </w:rPr>
-        <w:t>* co-senior authors</w:t>
+        <w:t>*co-senior authors</w:t>
       </w:r>
     </w:p>
     <w:p>
@@ -802,7 +746,7 @@
           <w:rFonts w:ascii="Arial" w:hAnsi="Arial" w:cs="Arial"/>
         </w:rPr>
       </w:pPr>
-      <w:hyperlink r:id="rId8" w:history="1">
+      <w:hyperlink r:id="rId4" w:history="1">
         <w:r>
           <w:rPr>
             <w:rStyle w:val="Hyperlink"/>
@@ -860,33 +804,193 @@
         <w:rPr>
           <w:rFonts w:ascii="Arial" w:hAnsi="Arial" w:cs="Arial"/>
         </w:rPr>
-        <w:t xml:space="preserve">We thank Madison Honore, Parker Major, Nina Safranski, and Mikayla Data for comments on previous versions of this manuscript and presentations of these ideas. We thank Parker Major, Nina Safranski, and Mikayla Datka for reviewing code in earlier versions of our R package, </w:t>
-      </w:r>
-      <w:proofErr w:type="spellStart"/>
-      <w:r>
-        <w:rPr>
-          <w:rFonts w:ascii="Arial" w:hAnsi="Arial" w:cs="Arial"/>
-        </w:rPr>
-        <w:t>paRsynth</w:t>
-      </w:r>
-      <w:proofErr w:type="spellEnd"/>
-      <w:r>
-        <w:rPr>
-          <w:rFonts w:ascii="Arial" w:hAnsi="Arial" w:cs="Arial"/>
-        </w:rPr>
-        <w:t>. Work on this manuscript was partially funded by the MSU ACRES REU Program (grant number 2349002) to GSV and A</w:t>
-      </w:r>
-      <w:r>
-        <w:rPr>
-          <w:rFonts w:ascii="Arial" w:hAnsi="Arial" w:cs="Arial"/>
-        </w:rPr>
-        <w:t>C</w:t>
+        <w:t xml:space="preserve">We thank Madison Honore, Parker Major, Nina Safranski, and Mikayla Data for </w:t>
+      </w:r>
+      <w:r>
+        <w:rPr>
+          <w:rFonts w:ascii="Arial" w:hAnsi="Arial" w:cs="Arial"/>
+        </w:rPr>
+        <w:t>feedback on this research</w:t>
+      </w:r>
+      <w:r>
+        <w:rPr>
+          <w:rFonts w:ascii="Arial" w:hAnsi="Arial" w:cs="Arial"/>
+        </w:rPr>
+        <w:t xml:space="preserve">. We </w:t>
+      </w:r>
+      <w:r>
+        <w:rPr>
+          <w:rFonts w:ascii="Arial" w:hAnsi="Arial" w:cs="Arial"/>
+        </w:rPr>
+        <w:t>are grateful to</w:t>
+      </w:r>
+      <w:r>
+        <w:rPr>
+          <w:rFonts w:ascii="Arial" w:hAnsi="Arial" w:cs="Arial"/>
+        </w:rPr>
+        <w:t xml:space="preserve"> Parker Major, Nina Safranski, and Mikayla Datka for reviewing </w:t>
+      </w:r>
+      <w:r>
+        <w:rPr>
+          <w:rFonts w:ascii="Arial" w:hAnsi="Arial" w:cs="Arial"/>
+        </w:rPr>
+        <w:t xml:space="preserve">early versions of </w:t>
+      </w:r>
+      <w:r>
+        <w:rPr>
+          <w:rFonts w:ascii="Arial" w:hAnsi="Arial" w:cs="Arial"/>
+        </w:rPr>
+        <w:t xml:space="preserve">our </w:t>
+      </w:r>
+      <w:r>
+        <w:rPr>
+          <w:rFonts w:ascii="Arial" w:hAnsi="Arial" w:cs="Arial"/>
+        </w:rPr>
+        <w:t>R package vignettes</w:t>
       </w:r>
       <w:r>
         <w:rPr>
           <w:rFonts w:ascii="Arial" w:hAnsi="Arial" w:cs="Arial"/>
         </w:rPr>
         <w:t xml:space="preserve">. </w:t>
+      </w:r>
+      <w:r>
+        <w:rPr>
+          <w:rFonts w:ascii="Arial" w:hAnsi="Arial" w:cs="Arial"/>
+        </w:rPr>
+        <w:t xml:space="preserve">This research was supported by funding </w:t>
+      </w:r>
+      <w:r>
+        <w:rPr>
+          <w:rFonts w:ascii="Arial" w:hAnsi="Arial" w:cs="Arial"/>
+        </w:rPr>
+        <w:t xml:space="preserve">to GSV </w:t>
+      </w:r>
+      <w:r>
+        <w:rPr>
+          <w:rFonts w:ascii="Arial" w:hAnsi="Arial" w:cs="Arial"/>
+        </w:rPr>
+        <w:t>from the Department of Integrative Biology, the Department of Computational Mathematics, Science, and Engineering, the College of Natural Science</w:t>
+      </w:r>
+      <w:r>
+        <w:rPr>
+          <w:rFonts w:ascii="Arial" w:hAnsi="Arial" w:cs="Arial"/>
+        </w:rPr>
+        <w:t xml:space="preserve">, and the </w:t>
+      </w:r>
+      <w:r>
+        <w:rPr>
+          <w:rFonts w:ascii="Arial" w:hAnsi="Arial" w:cs="Arial"/>
+        </w:rPr>
+        <w:t xml:space="preserve">Office of the </w:t>
+      </w:r>
+      <w:r>
+        <w:rPr>
+          <w:rFonts w:ascii="Arial" w:hAnsi="Arial" w:cs="Arial"/>
+        </w:rPr>
+        <w:t>Provost</w:t>
+      </w:r>
+      <w:r>
+        <w:rPr>
+          <w:rFonts w:ascii="Arial" w:hAnsi="Arial" w:cs="Arial"/>
+        </w:rPr>
+        <w:t xml:space="preserve"> at Michigan State University</w:t>
+      </w:r>
+      <w:r>
+        <w:rPr>
+          <w:rFonts w:ascii="Arial" w:hAnsi="Arial" w:cs="Arial"/>
+        </w:rPr>
+        <w:t xml:space="preserve"> (MSU)</w:t>
+      </w:r>
+      <w:r>
+        <w:rPr>
+          <w:rFonts w:ascii="Arial" w:hAnsi="Arial" w:cs="Arial"/>
+        </w:rPr>
+        <w:t>. AC was supported</w:t>
+      </w:r>
+      <w:r>
+        <w:rPr>
+          <w:rFonts w:ascii="Arial" w:hAnsi="Arial" w:cs="Arial"/>
+        </w:rPr>
+        <w:t xml:space="preserve"> by</w:t>
+      </w:r>
+      <w:r>
+        <w:rPr>
+          <w:rFonts w:ascii="Arial" w:hAnsi="Arial" w:cs="Arial"/>
+        </w:rPr>
+        <w:t xml:space="preserve"> </w:t>
+      </w:r>
+      <w:r>
+        <w:rPr>
+          <w:rFonts w:ascii="Arial" w:hAnsi="Arial" w:cs="Arial"/>
+        </w:rPr>
+        <w:t xml:space="preserve">the MSU </w:t>
+      </w:r>
+      <w:r>
+        <w:rPr>
+          <w:rFonts w:ascii="Arial" w:hAnsi="Arial" w:cs="Arial"/>
+        </w:rPr>
+        <w:t>Advanced Computational Research Ex</w:t>
+      </w:r>
+      <w:r>
+        <w:rPr>
+          <w:rFonts w:ascii="Arial" w:hAnsi="Arial" w:cs="Arial"/>
+        </w:rPr>
+        <w:t>periences (</w:t>
+      </w:r>
+      <w:r>
+        <w:rPr>
+          <w:rFonts w:ascii="Arial" w:hAnsi="Arial" w:cs="Arial"/>
+        </w:rPr>
+        <w:t>ACRES</w:t>
+      </w:r>
+      <w:r>
+        <w:rPr>
+          <w:rFonts w:ascii="Arial" w:hAnsi="Arial" w:cs="Arial"/>
+        </w:rPr>
+        <w:t>)</w:t>
+      </w:r>
+      <w:r>
+        <w:rPr>
+          <w:rFonts w:ascii="Arial" w:hAnsi="Arial" w:cs="Arial"/>
+        </w:rPr>
+        <w:t xml:space="preserve"> </w:t>
+      </w:r>
+      <w:r>
+        <w:rPr>
+          <w:rFonts w:ascii="Arial" w:hAnsi="Arial" w:cs="Arial"/>
+        </w:rPr>
+        <w:t xml:space="preserve">NSF </w:t>
+      </w:r>
+      <w:r>
+        <w:rPr>
+          <w:rFonts w:ascii="Arial" w:hAnsi="Arial" w:cs="Arial"/>
+        </w:rPr>
+        <w:t>REU Program</w:t>
+      </w:r>
+      <w:r>
+        <w:rPr>
+          <w:rFonts w:ascii="Arial" w:hAnsi="Arial" w:cs="Arial"/>
+        </w:rPr>
+        <w:t xml:space="preserve"> in summer 2024</w:t>
+      </w:r>
+      <w:r>
+        <w:rPr>
+          <w:rFonts w:ascii="Arial" w:hAnsi="Arial" w:cs="Arial"/>
+        </w:rPr>
+        <w:t xml:space="preserve"> (grant n</w:t>
+      </w:r>
+      <w:r>
+        <w:rPr>
+          <w:rFonts w:ascii="Arial" w:hAnsi="Arial" w:cs="Arial"/>
+        </w:rPr>
+        <w:t>umber</w:t>
+      </w:r>
+      <w:r>
+        <w:rPr>
+          <w:rFonts w:ascii="Arial" w:hAnsi="Arial" w:cs="Arial"/>
+        </w:rPr>
+        <w:t xml:space="preserve"> 2349002).</w:t>
       </w:r>
     </w:p>
     <w:p>
@@ -914,7 +1018,85 @@
         <w:rPr>
           <w:rFonts w:ascii="Arial" w:hAnsi="Arial" w:cs="Arial"/>
         </w:rPr>
-        <w:t xml:space="preserve">Code used to generate synthetic vocalizations, simulation </w:t>
+        <w:t>The pipeline we developed for the sonification of character strings is available as an R package on GitHub:</w:t>
+      </w:r>
+      <w:r>
+        <w:rPr>
+          <w:rFonts w:ascii="Arial" w:hAnsi="Arial" w:cs="Arial"/>
+        </w:rPr>
+        <w:t xml:space="preserve"> </w:t>
+      </w:r>
+      <w:r>
+        <w:rPr>
+          <w:rFonts w:ascii="Arial" w:hAnsi="Arial" w:cs="Arial"/>
+        </w:rPr>
+        <w:t>https://github.com/gsvidaurre/paRsynth</w:t>
+      </w:r>
+      <w:r>
+        <w:rPr>
+          <w:rFonts w:ascii="Arial" w:hAnsi="Arial" w:cs="Arial"/>
+        </w:rPr>
+        <w:t>.</w:t>
+      </w:r>
+      <w:r>
+        <w:rPr>
+          <w:rFonts w:ascii="Arial" w:hAnsi="Arial" w:cs="Arial"/>
+        </w:rPr>
+        <w:t xml:space="preserve"> </w:t>
+      </w:r>
+      <w:r>
+        <w:rPr>
+          <w:rFonts w:ascii="Arial" w:hAnsi="Arial" w:cs="Arial"/>
+        </w:rPr>
+        <w:t xml:space="preserve">All </w:t>
+      </w:r>
+      <w:r>
+        <w:rPr>
+          <w:rFonts w:ascii="Arial" w:hAnsi="Arial" w:cs="Arial"/>
+        </w:rPr>
+        <w:t>c</w:t>
+      </w:r>
+      <w:r>
+        <w:rPr>
+          <w:rFonts w:ascii="Arial" w:hAnsi="Arial" w:cs="Arial"/>
+        </w:rPr>
+        <w:t xml:space="preserve">ode </w:t>
+      </w:r>
+      <w:r>
+        <w:rPr>
+          <w:rFonts w:ascii="Arial" w:hAnsi="Arial" w:cs="Arial"/>
+        </w:rPr>
+        <w:t xml:space="preserve">associated with this manuscript, which we </w:t>
+      </w:r>
+      <w:r>
+        <w:rPr>
+          <w:rFonts w:ascii="Arial" w:hAnsi="Arial" w:cs="Arial"/>
+        </w:rPr>
+        <w:t>used to generate</w:t>
+      </w:r>
+      <w:r>
+        <w:rPr>
+          <w:rFonts w:ascii="Arial" w:hAnsi="Arial" w:cs="Arial"/>
+        </w:rPr>
+        <w:t xml:space="preserve"> example datasets of</w:t>
+      </w:r>
+      <w:r>
+        <w:rPr>
+          <w:rFonts w:ascii="Arial" w:hAnsi="Arial" w:cs="Arial"/>
+        </w:rPr>
+        <w:t xml:space="preserve"> synthetic vocalizations, </w:t>
+      </w:r>
+      <w:r>
+        <w:rPr>
+          <w:rFonts w:ascii="Arial" w:hAnsi="Arial" w:cs="Arial"/>
+        </w:rPr>
+        <w:t xml:space="preserve">perform </w:t>
+      </w:r>
+      <w:r>
+        <w:rPr>
+          <w:rFonts w:ascii="Arial" w:hAnsi="Arial" w:cs="Arial"/>
+        </w:rPr>
+        <w:t xml:space="preserve">simulation </w:t>
       </w:r>
       <w:r>
         <w:rPr>
@@ -926,27 +1108,103 @@
         <w:rPr>
           <w:rFonts w:ascii="Arial" w:hAnsi="Arial" w:cs="Arial"/>
         </w:rPr>
-        <w:t>, perform data analysis, and create figures in this manuscript is publicly available at (LINK)</w:t>
-      </w:r>
-      <w:r>
-        <w:rPr>
-          <w:rFonts w:ascii="Arial" w:hAnsi="Arial" w:cs="Arial"/>
-        </w:rPr>
-        <w:t xml:space="preserve">. Data generated for this publication </w:t>
-      </w:r>
-      <w:proofErr w:type="gramStart"/>
-      <w:r>
-        <w:rPr>
-          <w:rFonts w:ascii="Arial" w:hAnsi="Arial" w:cs="Arial"/>
-        </w:rPr>
-        <w:t>are</w:t>
-      </w:r>
-      <w:proofErr w:type="gramEnd"/>
-      <w:r>
-        <w:rPr>
-          <w:rFonts w:ascii="Arial" w:hAnsi="Arial" w:cs="Arial"/>
-        </w:rPr>
-        <w:t xml:space="preserve"> also available on GitHub. </w:t>
+        <w:t xml:space="preserve">, </w:t>
+      </w:r>
+      <w:r>
+        <w:rPr>
+          <w:rFonts w:ascii="Arial" w:hAnsi="Arial" w:cs="Arial"/>
+        </w:rPr>
+        <w:t>analyze simulated data</w:t>
+      </w:r>
+      <w:r>
+        <w:rPr>
+          <w:rFonts w:ascii="Arial" w:hAnsi="Arial" w:cs="Arial"/>
+        </w:rPr>
+        <w:t>, and create figures</w:t>
+      </w:r>
+      <w:r>
+        <w:rPr>
+          <w:rFonts w:ascii="Arial" w:hAnsi="Arial" w:cs="Arial"/>
+        </w:rPr>
+        <w:t>,</w:t>
+      </w:r>
+      <w:r>
+        <w:rPr>
+          <w:rFonts w:ascii="Arial" w:hAnsi="Arial" w:cs="Arial"/>
+        </w:rPr>
+        <w:t xml:space="preserve"> </w:t>
+      </w:r>
+      <w:r>
+        <w:rPr>
+          <w:rFonts w:ascii="Arial" w:hAnsi="Arial" w:cs="Arial"/>
+        </w:rPr>
+        <w:t>is</w:t>
+      </w:r>
+      <w:r>
+        <w:rPr>
+          <w:rFonts w:ascii="Arial" w:hAnsi="Arial" w:cs="Arial"/>
+        </w:rPr>
+        <w:t xml:space="preserve"> available </w:t>
+      </w:r>
+      <w:r>
+        <w:rPr>
+          <w:rFonts w:ascii="Arial" w:hAnsi="Arial" w:cs="Arial"/>
+        </w:rPr>
+        <w:t>on GitHub:</w:t>
+      </w:r>
+      <w:r>
+        <w:rPr>
+          <w:rFonts w:ascii="Arial" w:hAnsi="Arial" w:cs="Arial"/>
+        </w:rPr>
+        <w:t xml:space="preserve"> </w:t>
+      </w:r>
+      <w:r>
+        <w:rPr>
+          <w:rFonts w:ascii="Arial" w:hAnsi="Arial" w:cs="Arial"/>
+        </w:rPr>
+        <w:t>https://github.com/gsvidaurre/paRsynth-methods-paper</w:t>
+      </w:r>
+      <w:r>
+        <w:rPr>
+          <w:rFonts w:ascii="Arial" w:hAnsi="Arial" w:cs="Arial"/>
+        </w:rPr>
+        <w:t xml:space="preserve">. </w:t>
+      </w:r>
+      <w:r>
+        <w:rPr>
+          <w:rFonts w:ascii="Arial" w:hAnsi="Arial" w:cs="Arial"/>
+        </w:rPr>
+        <w:t xml:space="preserve">We have made </w:t>
+      </w:r>
+      <w:r>
+        <w:rPr>
+          <w:rFonts w:ascii="Arial" w:hAnsi="Arial" w:cs="Arial"/>
+        </w:rPr>
+        <w:t xml:space="preserve">accuracy </w:t>
+      </w:r>
+      <w:r>
+        <w:rPr>
+          <w:rFonts w:ascii="Arial" w:hAnsi="Arial" w:cs="Arial"/>
+        </w:rPr>
+        <w:t xml:space="preserve">data from our simulation experiments available in this </w:t>
+      </w:r>
+      <w:r>
+        <w:rPr>
+          <w:rFonts w:ascii="Arial" w:hAnsi="Arial" w:cs="Arial"/>
+        </w:rPr>
+        <w:t>GitHub</w:t>
+      </w:r>
+      <w:r>
+        <w:rPr>
+          <w:rFonts w:ascii="Arial" w:hAnsi="Arial" w:cs="Arial"/>
+        </w:rPr>
+        <w:t xml:space="preserve"> repository as well</w:t>
+      </w:r>
+      <w:r>
+        <w:rPr>
+          <w:rFonts w:ascii="Arial" w:hAnsi="Arial" w:cs="Arial"/>
+        </w:rPr>
+        <w:t>.</w:t>
       </w:r>
     </w:p>
     <w:p>
@@ -992,7 +1250,6 @@
           <w:bCs/>
         </w:rPr>
       </w:pPr>
-      <w:commentRangeStart w:id="2"/>
       <w:r>
         <w:rPr>
           <w:rFonts w:ascii="Arial" w:hAnsi="Arial" w:cs="Arial"/>
@@ -1007,183 +1264,261 @@
           <w:b/>
           <w:bCs/>
         </w:rPr>
-        <w:t>uthor Contributions</w:t>
-      </w:r>
-      <w:commentRangeEnd w:id="2"/>
-      <w:r>
-        <w:rPr>
-          <w:rStyle w:val="CommentReference"/>
-        </w:rPr>
-        <w:commentReference w:id="2"/>
-      </w:r>
-      <w:r>
-        <w:rPr>
-          <w:rFonts w:ascii="Arial" w:hAnsi="Arial" w:cs="Arial"/>
-          <w:b/>
-          <w:bCs/>
-        </w:rPr>
-        <w:t xml:space="preserve">: </w:t>
+        <w:t xml:space="preserve">uthor Contributions: </w:t>
+      </w:r>
+      <w:r>
+        <w:rPr>
+          <w:rFonts w:ascii="Arial" w:hAnsi="Arial" w:cs="Arial"/>
+        </w:rPr>
+        <w:t>GSV</w:t>
+      </w:r>
+      <w:r>
+        <w:rPr>
+          <w:rFonts w:ascii="Arial" w:hAnsi="Arial" w:cs="Arial"/>
+        </w:rPr>
+        <w:t xml:space="preserve">, VF, and </w:t>
+      </w:r>
+      <w:r>
+        <w:rPr>
+          <w:rFonts w:ascii="Arial" w:hAnsi="Arial" w:cs="Arial"/>
+        </w:rPr>
+        <w:t xml:space="preserve">AC </w:t>
+      </w:r>
+      <w:r>
+        <w:rPr>
+          <w:rFonts w:ascii="Arial" w:hAnsi="Arial" w:cs="Arial"/>
+        </w:rPr>
+        <w:t>conceived the idea and developed the initial code and documentation. AC w</w:t>
+      </w:r>
+      <w:r>
+        <w:rPr>
+          <w:rFonts w:ascii="Arial" w:hAnsi="Arial" w:cs="Arial"/>
+        </w:rPr>
+        <w:t xml:space="preserve">rote the first version of all package functions and </w:t>
+      </w:r>
+      <w:r>
+        <w:rPr>
+          <w:rFonts w:ascii="Arial" w:hAnsi="Arial" w:cs="Arial"/>
+        </w:rPr>
+        <w:t>contributed to the</w:t>
+      </w:r>
+      <w:r>
+        <w:rPr>
+          <w:rFonts w:ascii="Arial" w:hAnsi="Arial" w:cs="Arial"/>
+        </w:rPr>
+        <w:t xml:space="preserve"> fine</w:t>
+      </w:r>
+      <w:r>
+        <w:rPr>
+          <w:rFonts w:ascii="Arial" w:hAnsi="Arial" w:cs="Arial"/>
+        </w:rPr>
+        <w:t>-</w:t>
+      </w:r>
+      <w:r>
+        <w:rPr>
+          <w:rFonts w:ascii="Arial" w:hAnsi="Arial" w:cs="Arial"/>
+        </w:rPr>
+        <w:t xml:space="preserve">tuning of functions and </w:t>
+      </w:r>
+      <w:r>
+        <w:rPr>
+          <w:rFonts w:ascii="Arial" w:hAnsi="Arial" w:cs="Arial"/>
+        </w:rPr>
+        <w:t xml:space="preserve">the </w:t>
+      </w:r>
+      <w:r>
+        <w:rPr>
+          <w:rFonts w:ascii="Arial" w:hAnsi="Arial" w:cs="Arial"/>
+        </w:rPr>
+        <w:t>foundation for package development. RS, GAJ, and GSV contributed to further code development, specifically package development, bug fixes, documentation, fine-tuning functions</w:t>
+      </w:r>
+      <w:r>
+        <w:rPr>
+          <w:rFonts w:ascii="Arial" w:hAnsi="Arial" w:cs="Arial"/>
+        </w:rPr>
+        <w:t>,</w:t>
+      </w:r>
+      <w:r>
+        <w:rPr>
+          <w:rFonts w:ascii="Arial" w:hAnsi="Arial" w:cs="Arial"/>
+        </w:rPr>
+        <w:t xml:space="preserve"> and unit testing. GAJ was responsible for vignette development. </w:t>
+      </w:r>
+      <w:r>
+        <w:rPr>
+          <w:rFonts w:ascii="Arial" w:hAnsi="Arial" w:cs="Arial"/>
+        </w:rPr>
+        <w:t xml:space="preserve">GSV led </w:t>
+      </w:r>
+      <w:r>
+        <w:rPr>
+          <w:rFonts w:ascii="Arial" w:hAnsi="Arial" w:cs="Arial"/>
+        </w:rPr>
+        <w:t xml:space="preserve">the </w:t>
+      </w:r>
+      <w:r>
+        <w:rPr>
+          <w:rFonts w:ascii="Arial" w:hAnsi="Arial" w:cs="Arial"/>
+        </w:rPr>
+        <w:t xml:space="preserve">design and implementation of </w:t>
+      </w:r>
+      <w:r>
+        <w:rPr>
+          <w:rFonts w:ascii="Arial" w:hAnsi="Arial" w:cs="Arial"/>
+        </w:rPr>
+        <w:t>simulation experiments</w:t>
+      </w:r>
+      <w:r>
+        <w:rPr>
+          <w:rFonts w:ascii="Arial" w:hAnsi="Arial" w:cs="Arial"/>
+        </w:rPr>
+        <w:t xml:space="preserve"> with </w:t>
+      </w:r>
+      <w:r>
+        <w:rPr>
+          <w:rFonts w:ascii="Arial" w:hAnsi="Arial" w:cs="Arial"/>
+        </w:rPr>
+        <w:t xml:space="preserve">additional contributions by </w:t>
+      </w:r>
+      <w:r>
+        <w:rPr>
+          <w:rFonts w:ascii="Arial" w:hAnsi="Arial" w:cs="Arial"/>
+        </w:rPr>
+        <w:t>AC</w:t>
+      </w:r>
+      <w:r>
+        <w:rPr>
+          <w:rFonts w:ascii="Arial" w:hAnsi="Arial" w:cs="Arial"/>
+        </w:rPr>
+        <w:t xml:space="preserve">, </w:t>
+      </w:r>
+      <w:r>
+        <w:rPr>
+          <w:rFonts w:ascii="Arial" w:hAnsi="Arial" w:cs="Arial"/>
+        </w:rPr>
+        <w:t>VF</w:t>
+      </w:r>
+      <w:r>
+        <w:rPr>
+          <w:rFonts w:ascii="Arial" w:hAnsi="Arial" w:cs="Arial"/>
+        </w:rPr>
+        <w:t>, and BAC</w:t>
+      </w:r>
+      <w:r>
+        <w:rPr>
+          <w:rFonts w:ascii="Arial" w:hAnsi="Arial" w:cs="Arial"/>
+        </w:rPr>
+        <w:t>.</w:t>
+      </w:r>
+      <w:r>
+        <w:rPr>
+          <w:rFonts w:ascii="Arial" w:hAnsi="Arial" w:cs="Arial"/>
+        </w:rPr>
+        <w:t xml:space="preserve"> </w:t>
+      </w:r>
+      <w:r>
+        <w:rPr>
+          <w:rFonts w:ascii="Arial" w:hAnsi="Arial" w:cs="Arial"/>
+        </w:rPr>
+        <w:t xml:space="preserve">BAC, VF, and GSV were responsible for </w:t>
+      </w:r>
+      <w:r>
+        <w:rPr>
+          <w:rFonts w:ascii="Arial" w:hAnsi="Arial" w:cs="Arial"/>
+        </w:rPr>
+        <w:t xml:space="preserve">simulated </w:t>
+      </w:r>
+      <w:r>
+        <w:rPr>
+          <w:rFonts w:ascii="Arial" w:hAnsi="Arial" w:cs="Arial"/>
+        </w:rPr>
+        <w:t xml:space="preserve">data analysis. BAC, SGE, and GSV led figure development. BAC </w:t>
+      </w:r>
+      <w:r>
+        <w:rPr>
+          <w:rFonts w:ascii="Arial" w:hAnsi="Arial" w:cs="Arial"/>
+        </w:rPr>
+        <w:t xml:space="preserve">and GSV </w:t>
+      </w:r>
+      <w:r>
+        <w:rPr>
+          <w:rFonts w:ascii="Arial" w:hAnsi="Arial" w:cs="Arial"/>
+        </w:rPr>
+        <w:t>led the writing</w:t>
+      </w:r>
+      <w:r>
+        <w:rPr>
+          <w:rFonts w:ascii="Arial" w:hAnsi="Arial" w:cs="Arial"/>
+        </w:rPr>
+        <w:t xml:space="preserve"> of the manuscript</w:t>
+      </w:r>
+      <w:r>
+        <w:rPr>
+          <w:rFonts w:ascii="Arial" w:hAnsi="Arial" w:cs="Arial"/>
+        </w:rPr>
+        <w:t xml:space="preserve">, with </w:t>
+      </w:r>
+      <w:r>
+        <w:rPr>
+          <w:rFonts w:ascii="Arial" w:hAnsi="Arial" w:cs="Arial"/>
+        </w:rPr>
+        <w:t>feedback first from SGE, then all other co-authors</w:t>
+      </w:r>
+      <w:r>
+        <w:rPr>
+          <w:rFonts w:ascii="Arial" w:hAnsi="Arial" w:cs="Arial"/>
+        </w:rPr>
+        <w:t>. BAC</w:t>
+      </w:r>
+      <w:r>
+        <w:rPr>
+          <w:rFonts w:ascii="Arial" w:hAnsi="Arial" w:cs="Arial"/>
+        </w:rPr>
+        <w:t xml:space="preserve"> and GSV performed the first round of code review for all code associated with the manuscript</w:t>
+      </w:r>
+      <w:r>
+        <w:rPr>
+          <w:rFonts w:ascii="Arial" w:hAnsi="Arial" w:cs="Arial"/>
+        </w:rPr>
+        <w:t>.</w:t>
+      </w:r>
+      <w:r>
+        <w:rPr>
+          <w:rFonts w:ascii="Arial" w:hAnsi="Arial" w:cs="Arial"/>
+        </w:rPr>
+        <w:t xml:space="preserve"> BAC, </w:t>
+      </w:r>
+      <w:r>
+        <w:rPr>
+          <w:rFonts w:ascii="Arial" w:hAnsi="Arial" w:cs="Arial"/>
+        </w:rPr>
+        <w:t>SGE, RS, GA</w:t>
+      </w:r>
+      <w:r>
+        <w:rPr>
+          <w:rFonts w:ascii="Arial" w:hAnsi="Arial" w:cs="Arial"/>
+        </w:rPr>
+        <w:t xml:space="preserve">J performed a second round of </w:t>
+      </w:r>
+      <w:r>
+        <w:rPr>
+          <w:rFonts w:ascii="Arial" w:hAnsi="Arial" w:cs="Arial"/>
+        </w:rPr>
+        <w:t>code review. All authors read final versions of drafts and gave</w:t>
+      </w:r>
+      <w:r>
+        <w:rPr>
+          <w:rFonts w:ascii="Arial" w:hAnsi="Arial" w:cs="Arial"/>
+        </w:rPr>
+        <w:t xml:space="preserve"> their</w:t>
+      </w:r>
+      <w:r>
+        <w:rPr>
+          <w:rFonts w:ascii="Arial" w:hAnsi="Arial" w:cs="Arial"/>
+        </w:rPr>
+        <w:t xml:space="preserve"> final approval for publication.</w:t>
       </w:r>
     </w:p>
-    <w:p>
-      <w:pPr>
-        <w:rPr>
-          <w:rFonts w:ascii="Arial" w:hAnsi="Arial" w:cs="Arial"/>
-        </w:rPr>
-      </w:pPr>
-      <w:r>
-        <w:rPr>
-          <w:rFonts w:ascii="Arial" w:hAnsi="Arial" w:cs="Arial"/>
-        </w:rPr>
-        <w:t>AC</w:t>
-      </w:r>
-      <w:r>
-        <w:rPr>
-          <w:rFonts w:ascii="Arial" w:hAnsi="Arial" w:cs="Arial"/>
-        </w:rPr>
-        <w:t xml:space="preserve">, VF, and GSV conceived the idea and developed the initial code and documentation. AC was involved in fine tuning of functions and foundation for package development. RS, GAJ, and GSV contributed to further code development, specifically package development, bug fixes, documentation, fine-tuning functions and unit testing. GAJ was responsible for vignette development. </w:t>
-      </w:r>
-      <w:r>
-        <w:rPr>
-          <w:rFonts w:ascii="Arial" w:hAnsi="Arial" w:cs="Arial"/>
-        </w:rPr>
-        <w:t xml:space="preserve">BAC, VF, and GSV were responsible for data </w:t>
-      </w:r>
-      <w:r>
-        <w:rPr>
-          <w:rFonts w:ascii="Arial" w:hAnsi="Arial" w:cs="Arial"/>
-        </w:rPr>
-        <w:lastRenderedPageBreak/>
-        <w:t xml:space="preserve">analysis. BAC, SGE, and GSV led figure development. BAC led the primary writing, with SGE and GSV as secondary writers. BAC, SGE, RS, GAJ, and GSV performed code review on all code for the manuscript. All authors read final versions of drafts and gave final approval for publication. </w:t>
-      </w:r>
-    </w:p>
-    <w:p>
-      <w:pPr>
-        <w:rPr>
-          <w:rFonts w:ascii="Arial" w:hAnsi="Arial" w:cs="Arial"/>
-        </w:rPr>
-      </w:pPr>
-    </w:p>
-    <w:p>
-      <w:pPr>
-        <w:rPr>
-          <w:rFonts w:ascii="Arial" w:hAnsi="Arial" w:cs="Arial"/>
-        </w:rPr>
-      </w:pPr>
-    </w:p>
-    <w:p>
-      <w:pPr>
-        <w:rPr>
-          <w:rFonts w:ascii="Arial" w:hAnsi="Arial" w:cs="Arial"/>
-        </w:rPr>
-      </w:pPr>
-      <w:commentRangeStart w:id="3"/>
-      <w:r>
-        <w:rPr>
-          <w:rFonts w:ascii="Arial" w:hAnsi="Arial" w:cs="Arial"/>
-        </w:rPr>
-        <w:t>TKTK under construction – please add contributions!</w:t>
-      </w:r>
-    </w:p>
-    <w:p>
-      <w:pPr>
-        <w:rPr>
-          <w:rFonts w:ascii="Arial" w:hAnsi="Arial" w:cs="Arial"/>
-        </w:rPr>
-      </w:pPr>
-      <w:r>
-        <w:rPr>
-          <w:rFonts w:ascii="Arial" w:hAnsi="Arial" w:cs="Arial"/>
-        </w:rPr>
-        <w:t>BAC – primary writing, analysis, figure creation, code review</w:t>
-      </w:r>
-    </w:p>
-    <w:p>
-      <w:pPr>
-        <w:rPr>
-          <w:rFonts w:ascii="Arial" w:hAnsi="Arial" w:cs="Arial"/>
-        </w:rPr>
-      </w:pPr>
-      <w:r>
-        <w:rPr>
-          <w:rFonts w:ascii="Arial" w:hAnsi="Arial" w:cs="Arial"/>
-        </w:rPr>
-        <w:t>SGE – analysis, figure creation, secondary writing, code review</w:t>
-      </w:r>
-    </w:p>
-    <w:p>
-      <w:pPr>
-        <w:rPr>
-          <w:rFonts w:ascii="Arial" w:hAnsi="Arial" w:cs="Arial"/>
-        </w:rPr>
-      </w:pPr>
-      <w:r>
-        <w:rPr>
-          <w:rFonts w:ascii="Arial" w:hAnsi="Arial" w:cs="Arial"/>
-        </w:rPr>
-        <w:t>AC – idea conception, initial and primary code development and documentation, fine-tuning of functions, foundation for package development</w:t>
-      </w:r>
-    </w:p>
-    <w:p>
-      <w:pPr>
-        <w:rPr>
-          <w:rFonts w:ascii="Arial" w:hAnsi="Arial" w:cs="Arial"/>
-        </w:rPr>
-      </w:pPr>
-      <w:r>
-        <w:rPr>
-          <w:rFonts w:ascii="Arial" w:hAnsi="Arial" w:cs="Arial"/>
-        </w:rPr>
-        <w:t>RS – further code development, including package development, bug fixes, documentation, fine-tuning of functions, unit testing, code review</w:t>
-      </w:r>
-    </w:p>
-    <w:p>
-      <w:pPr>
-        <w:rPr>
-          <w:rFonts w:ascii="Arial" w:hAnsi="Arial" w:cs="Arial"/>
-        </w:rPr>
-      </w:pPr>
-      <w:r>
-        <w:rPr>
-          <w:rFonts w:ascii="Arial" w:hAnsi="Arial" w:cs="Arial"/>
-        </w:rPr>
-        <w:t>GAJ – further code development, vignette development, including fine-tuning of function, unit testing, package development, bug fixes, documentation, code review</w:t>
-      </w:r>
-    </w:p>
-    <w:p>
-      <w:pPr>
-        <w:rPr>
-          <w:rFonts w:ascii="Arial" w:hAnsi="Arial" w:cs="Arial"/>
-        </w:rPr>
-      </w:pPr>
-      <w:r>
-        <w:rPr>
-          <w:rFonts w:ascii="Arial" w:hAnsi="Arial" w:cs="Arial"/>
-        </w:rPr>
-        <w:t>VF – idea conception, code development, analysis, writing</w:t>
-      </w:r>
-    </w:p>
-    <w:p>
-      <w:pPr>
-        <w:rPr>
-          <w:rFonts w:ascii="Arial" w:hAnsi="Arial" w:cs="Arial"/>
-        </w:rPr>
-      </w:pPr>
-      <w:r>
-        <w:rPr>
-          <w:rFonts w:ascii="Arial" w:hAnsi="Arial" w:cs="Arial"/>
-        </w:rPr>
-        <w:t>GSV – idea conception, initial and continued code development, writing, analysis, figure creation, code review</w:t>
-      </w:r>
-      <w:commentRangeEnd w:id="3"/>
-      <w:r>
-        <w:rPr>
-          <w:rStyle w:val="CommentReference"/>
-        </w:rPr>
-        <w:commentReference w:id="3"/>
-      </w:r>
-    </w:p>
-    <w:p/>
     <w:sectPr>
       <w:pgSz w:w="12240" w:h="15840"/>
       <w:pgMar w:top="1440" w:right="1440" w:bottom="1440" w:left="1440" w:header="720" w:footer="720" w:gutter="0"/>
@@ -1192,144 +1527,6 @@
     </w:sectPr>
   </w:body>
 </w:document>
-</file>
-
-<file path=word/comments.xml><?xml version="1.0" encoding="utf-8"?>
-<w:comments xmlns:wpc="http://schemas.microsoft.com/office/word/2010/wordprocessingCanvas" xmlns:cx="http://schemas.microsoft.com/office/drawing/2014/chartex" xmlns:cx1="http://schemas.microsoft.com/office/drawing/2015/9/8/chartex" xmlns:cx2="http://schemas.microsoft.com/office/drawing/2015/10/21/chartex" xmlns:cx3="http://schemas.microsoft.com/office/drawing/2016/5/9/chartex" xmlns:cx4="http://schemas.microsoft.com/office/drawing/2016/5/10/chartex" xmlns:cx5="http://schemas.microsoft.com/office/drawing/2016/5/11/chartex" xmlns:cx6="http://schemas.microsoft.com/office/drawing/2016/5/12/chartex" xmlns:cx7="http://schemas.microsoft.com/office/drawing/2016/5/13/chartex" xmlns:cx8="http://schemas.microsoft.com/office/drawing/2016/5/14/chartex" xmlns:mc="http://schemas.openxmlformats.org/markup-compatibility/2006" xmlns:aink="http://schemas.microsoft.com/office/drawing/2016/ink" xmlns:am3d="http://schemas.microsoft.com/office/drawing/2017/model3d" xmlns:o="urn:schemas-microsoft-com:office:office" xmlns:oel="http://schemas.microsoft.com/office/2019/extlst" xmlns:r="http://schemas.openxmlformats.org/officeDocument/2006/relationships" xmlns:m="http://schemas.openxmlformats.org/officeDocument/2006/math" xmlns:v="urn:schemas-microsoft-com:vml" xmlns:wp14="http://schemas.microsoft.com/office/word/2010/wordprocessingDrawing" xmlns:wp="http://schemas.openxmlformats.org/drawingml/2006/wordprocessingDrawing" xmlns:w10="urn:schemas-microsoft-com:office:word" xmlns:w="http://schemas.openxmlformats.org/wordprocessingml/2006/main" xmlns:w14="http://schemas.microsoft.com/office/word/2010/wordml" xmlns:w15="http://schemas.microsoft.com/office/word/2012/wordml" xmlns:w16cex="http://schemas.microsoft.com/office/word/2018/wordml/cex" xmlns:w16cid="http://schemas.microsoft.com/office/word/2016/wordml/cid" xmlns:w16="http://schemas.microsoft.com/office/word/2018/wordml" xmlns:w16du="http://schemas.microsoft.com/office/word/2023/wordml/word16du" xmlns:w16sdtdh="http://schemas.microsoft.com/office/word/2020/wordml/sdtdatahash" xmlns:w16sdtfl="http://schemas.microsoft.com/office/word/2024/wordml/sdtformatlock" xmlns:w16se="http://schemas.microsoft.com/office/word/2015/wordml/symex" xmlns:wpg="http://schemas.microsoft.com/office/word/2010/wordprocessingGroup" xmlns:wpi="http://schemas.microsoft.com/office/word/2010/wordprocessingInk" xmlns:wne="http://schemas.microsoft.com/office/word/2006/wordml" xmlns:wps="http://schemas.microsoft.com/office/word/2010/wordprocessingShape" mc:Ignorable="w14 w15 w16se w16cid w16 w16cex w16sdtdh w16sdtfl w16du wp14">
-  <w:comment w:id="0" w:author="Coppinger, Brittany" w:date="2025-04-04T12:49:00Z" w:initials="BC">
-    <w:p>
-      <w:pPr>
-        <w:pStyle w:val="CommentText"/>
-      </w:pPr>
-      <w:r>
-        <w:rPr>
-          <w:rStyle w:val="CommentReference"/>
-        </w:rPr>
-        <w:annotationRef/>
-      </w:r>
-      <w:r>
-        <w:t>Comp Bio: full title is 200 characters</w:t>
-      </w:r>
-    </w:p>
-  </w:comment>
-  <w:comment w:id="1" w:author="Coppinger, Brittany" w:date="2025-08-26T10:11:00Z" w:initials="BC">
-    <w:p>
-      <w:pPr>
-        <w:pStyle w:val="CommentText"/>
-      </w:pPr>
-      <w:r>
-        <w:rPr>
-          <w:rStyle w:val="CommentReference"/>
-        </w:rPr>
-        <w:annotationRef/>
-      </w:r>
-      <w:r>
-        <w:t xml:space="preserve">Shouldn’t this be “using synthetic frequency-modulated…” It seems like a weird half phrase the way it is now. </w:t>
-      </w:r>
-    </w:p>
-  </w:comment>
-  <w:comment w:id="2" w:author="Coppinger, Brittany" w:date="2024-12-16T10:08:00Z" w:initials="BC">
-    <w:p>
-      <w:pPr>
-        <w:pStyle w:val="CommentText"/>
-      </w:pPr>
-      <w:r>
-        <w:rPr>
-          <w:rStyle w:val="CommentReference"/>
-        </w:rPr>
-        <w:annotationRef/>
-      </w:r>
-      <w:r>
-        <w:rPr>
-          <w:color w:val="1C1D1E"/>
-          <w:highlight w:val="white"/>
-        </w:rPr>
-        <w:t>The statement should include an explanation of the contribution of each author, and each author should be mentioned by name.If you would like to use the </w:t>
-      </w:r>
-      <w:hyperlink r:id="rId1" w:history="1">
-        <w:r>
-          <w:rPr>
-            <w:rStyle w:val="Hyperlink"/>
-            <w:highlight w:val="white"/>
-          </w:rPr>
-          <w:t>CrediT taxonomy</w:t>
-        </w:r>
-      </w:hyperlink>
-      <w:r>
-        <w:rPr>
-          <w:color w:val="1C1D1E"/>
-          <w:highlight w:val="white"/>
-        </w:rPr>
-        <w:t>, you are welcome to do so. We suggest the following format for the Author Contributions statement:</w:t>
-      </w:r>
-    </w:p>
-    <w:p>
-      <w:pPr>
-        <w:pStyle w:val="CommentText"/>
-      </w:pPr>
-      <w:r>
-        <w:rPr>
-          <w:i/>
-          <w:iCs/>
-          <w:color w:val="1C1D1E"/>
-          <w:highlight w:val="white"/>
-        </w:rPr>
-        <w:t>[Name of author 1] and [Name of author 2] conceived the ideas and designed methodology; [Name of author 1] and [Name of author 3] collected the data; [Name of author 2] and [Name of author 4] analysed the data; [Name of author 1] and [Name of author 4] led the writing of the manuscript. All authors contributed critically to the drafts and gave final approval for publication.</w:t>
-      </w:r>
-    </w:p>
-  </w:comment>
-  <w:comment w:id="3" w:author="Coppinger, Brittany" w:date="2025-08-26T10:39:00Z" w:initials="BC">
-    <w:p>
-      <w:pPr>
-        <w:pStyle w:val="CommentText"/>
-      </w:pPr>
-      <w:r>
-        <w:rPr>
-          <w:rStyle w:val="CommentReference"/>
-        </w:rPr>
-        <w:annotationRef/>
-      </w:r>
-      <w:r>
-        <w:t xml:space="preserve">After you edit the contribution paragraph, don’t forget to delete this! Leaving it here now just in case. </w:t>
-      </w:r>
-    </w:p>
-  </w:comment>
-</w:comments>
-</file>
-
-<file path=word/commentsExtended.xml><?xml version="1.0" encoding="utf-8"?>
-<w15:commentsEx xmlns:wpc="http://schemas.microsoft.com/office/word/2010/wordprocessingCanvas" xmlns:cx="http://schemas.microsoft.com/office/drawing/2014/chartex" xmlns:cx1="http://schemas.microsoft.com/office/drawing/2015/9/8/chartex" xmlns:cx2="http://schemas.microsoft.com/office/drawing/2015/10/21/chartex" xmlns:cx3="http://schemas.microsoft.com/office/drawing/2016/5/9/chartex" xmlns:cx4="http://schemas.microsoft.com/office/drawing/2016/5/10/chartex" xmlns:cx5="http://schemas.microsoft.com/office/drawing/2016/5/11/chartex" xmlns:cx6="http://schemas.microsoft.com/office/drawing/2016/5/12/chartex" xmlns:cx7="http://schemas.microsoft.com/office/drawing/2016/5/13/chartex" xmlns:cx8="http://schemas.microsoft.com/office/drawing/2016/5/14/chartex" xmlns:mc="http://schemas.openxmlformats.org/markup-compatibility/2006" xmlns:aink="http://schemas.microsoft.com/office/drawing/2016/ink" xmlns:am3d="http://schemas.microsoft.com/office/drawing/2017/model3d" xmlns:o="urn:schemas-microsoft-com:office:office" xmlns:oel="http://schemas.microsoft.com/office/2019/extlst" xmlns:r="http://schemas.openxmlformats.org/officeDocument/2006/relationships" xmlns:m="http://schemas.openxmlformats.org/officeDocument/2006/math" xmlns:v="urn:schemas-microsoft-com:vml" xmlns:wp14="http://schemas.microsoft.com/office/word/2010/wordprocessingDrawing" xmlns:wp="http://schemas.openxmlformats.org/drawingml/2006/wordprocessingDrawing" xmlns:w10="urn:schemas-microsoft-com:office:word" xmlns:w="http://schemas.openxmlformats.org/wordprocessingml/2006/main" xmlns:w14="http://schemas.microsoft.com/office/word/2010/wordml" xmlns:w15="http://schemas.microsoft.com/office/word/2012/wordml" xmlns:w16cex="http://schemas.microsoft.com/office/word/2018/wordml/cex" xmlns:w16cid="http://schemas.microsoft.com/office/word/2016/wordml/cid" xmlns:w16="http://schemas.microsoft.com/office/word/2018/wordml" xmlns:w16du="http://schemas.microsoft.com/office/word/2023/wordml/word16du" xmlns:w16sdtdh="http://schemas.microsoft.com/office/word/2020/wordml/sdtdatahash" xmlns:w16sdtfl="http://schemas.microsoft.com/office/word/2024/wordml/sdtformatlock" xmlns:w16se="http://schemas.microsoft.com/office/word/2015/wordml/symex" xmlns:wpg="http://schemas.microsoft.com/office/word/2010/wordprocessingGroup" xmlns:wpi="http://schemas.microsoft.com/office/word/2010/wordprocessingInk" xmlns:wne="http://schemas.microsoft.com/office/word/2006/wordml" xmlns:wps="http://schemas.microsoft.com/office/word/2010/wordprocessingShape" mc:Ignorable="w14 w15 w16se w16cid w16 w16cex w16sdtdh w16sdtfl w16du wp14">
-  <w15:commentEx w15:paraId="6143D7D6" w15:done="0"/>
-  <w15:commentEx w15:paraId="2369FD69" w15:paraIdParent="6143D7D6" w15:done="0"/>
-  <w15:commentEx w15:paraId="3E4617F7" w15:done="0"/>
-  <w15:commentEx w15:paraId="09814BAC" w15:done="0"/>
-</w15:commentsEx>
-</file>
-
-<file path=word/commentsExtensible.xml><?xml version="1.0" encoding="utf-8"?>
-<w16cex:commentsExtensible xmlns:wpc="http://schemas.microsoft.com/office/word/2010/wordprocessingCanvas" xmlns:cx="http://schemas.microsoft.com/office/drawing/2014/chartex" xmlns:cx1="http://schemas.microsoft.com/office/drawing/2015/9/8/chartex" xmlns:cx2="http://schemas.microsoft.com/office/drawing/2015/10/21/chartex" xmlns:cx3="http://schemas.microsoft.com/office/drawing/2016/5/9/chartex" xmlns:cx4="http://schemas.microsoft.com/office/drawing/2016/5/10/chartex" xmlns:cx5="http://schemas.microsoft.com/office/drawing/2016/5/11/chartex" xmlns:cx6="http://schemas.microsoft.com/office/drawing/2016/5/12/chartex" xmlns:cx7="http://schemas.microsoft.com/office/drawing/2016/5/13/chartex" xmlns:cx8="http://schemas.microsoft.com/office/drawing/2016/5/14/chartex" xmlns:cr="http://schemas.microsoft.com/office/comments/2020/reactions" xmlns:mc="http://schemas.openxmlformats.org/markup-compatibility/2006" xmlns:aink="http://schemas.microsoft.com/office/drawing/2016/ink" xmlns:am3d="http://schemas.microsoft.com/office/drawing/2017/model3d" xmlns:o="urn:schemas-microsoft-com:office:office" xmlns:oel="http://schemas.microsoft.com/office/2019/extlst" xmlns:r="http://schemas.openxmlformats.org/officeDocument/2006/relationships" xmlns:m="http://schemas.openxmlformats.org/officeDocument/2006/math" xmlns:v="urn:schemas-microsoft-com:vml" xmlns:wp14="http://schemas.microsoft.com/office/word/2010/wordprocessingDrawing" xmlns:wp="http://schemas.openxmlformats.org/drawingml/2006/wordprocessingDrawing" xmlns:w10="urn:schemas-microsoft-com:office:word" xmlns:w="http://schemas.openxmlformats.org/wordprocessingml/2006/main" xmlns:w14="http://schemas.microsoft.com/office/word/2010/wordml" xmlns:w15="http://schemas.microsoft.com/office/word/2012/wordml" xmlns:w16cex="http://schemas.microsoft.com/office/word/2018/wordml/cex" xmlns:w16cid="http://schemas.microsoft.com/office/word/2016/wordml/cid" xmlns:w16="http://schemas.microsoft.com/office/word/2018/wordml" xmlns:w16du="http://schemas.microsoft.com/office/word/2023/wordml/word16du" xmlns:w16sdtdh="http://schemas.microsoft.com/office/word/2020/wordml/sdtdatahash" xmlns:w16sdtfl="http://schemas.microsoft.com/office/word/2024/wordml/sdtformatlock" xmlns:w16se="http://schemas.microsoft.com/office/word/2015/wordml/symex" xmlns:wpg="http://schemas.microsoft.com/office/word/2010/wordprocessingGroup" xmlns:wpi="http://schemas.microsoft.com/office/word/2010/wordprocessingInk" xmlns:wne="http://schemas.microsoft.com/office/word/2006/wordml" xmlns:wps="http://schemas.microsoft.com/office/word/2010/wordprocessingShape" mc:Ignorable="w14 w15 w16se w16cid w16 w16cex w16sdtdh w16sdtfl cr w16du wp14">
-  <w16cex:commentExtensible w16cex:durableId="2D3B6B7D" w16cex:dateUtc="2025-04-04T16:49:00Z"/>
-  <w16cex:commentExtensible w16cex:durableId="094B62E8" w16cex:dateUtc="2025-08-26T14:11:00Z"/>
-  <w16cex:commentExtensible w16cex:durableId="732838DB" w16cex:dateUtc="2024-12-16T15:08:00Z"/>
-  <w16cex:commentExtensible w16cex:durableId="4CCB2853" w16cex:dateUtc="2025-08-26T14:39:00Z"/>
-</w16cex:commentsExtensible>
-</file>
-
-<file path=word/commentsIds.xml><?xml version="1.0" encoding="utf-8"?>
-<w16cid:commentsIds xmlns:wpc="http://schemas.microsoft.com/office/word/2010/wordprocessingCanvas" xmlns:cx="http://schemas.microsoft.com/office/drawing/2014/chartex" xmlns:cx1="http://schemas.microsoft.com/office/drawing/2015/9/8/chartex" xmlns:cx2="http://schemas.microsoft.com/office/drawing/2015/10/21/chartex" xmlns:cx3="http://schemas.microsoft.com/office/drawing/2016/5/9/chartex" xmlns:cx4="http://schemas.microsoft.com/office/drawing/2016/5/10/chartex" xmlns:cx5="http://schemas.microsoft.com/office/drawing/2016/5/11/chartex" xmlns:cx6="http://schemas.microsoft.com/office/drawing/2016/5/12/chartex" xmlns:cx7="http://schemas.microsoft.com/office/drawing/2016/5/13/chartex" xmlns:cx8="http://schemas.microsoft.com/office/drawing/2016/5/14/chartex" xmlns:mc="http://schemas.openxmlformats.org/markup-compatibility/2006" xmlns:aink="http://schemas.microsoft.com/office/drawing/2016/ink" xmlns:am3d="http://schemas.microsoft.com/office/drawing/2017/model3d" xmlns:o="urn:schemas-microsoft-com:office:office" xmlns:oel="http://schemas.microsoft.com/office/2019/extlst" xmlns:r="http://schemas.openxmlformats.org/officeDocument/2006/relationships" xmlns:m="http://schemas.openxmlformats.org/officeDocument/2006/math" xmlns:v="urn:schemas-microsoft-com:vml" xmlns:wp14="http://schemas.microsoft.com/office/word/2010/wordprocessingDrawing" xmlns:wp="http://schemas.openxmlformats.org/drawingml/2006/wordprocessingDrawing" xmlns:w10="urn:schemas-microsoft-com:office:word" xmlns:w="http://schemas.openxmlformats.org/wordprocessingml/2006/main" xmlns:w14="http://schemas.microsoft.com/office/word/2010/wordml" xmlns:w15="http://schemas.microsoft.com/office/word/2012/wordml" xmlns:w16cex="http://schemas.microsoft.com/office/word/2018/wordml/cex" xmlns:w16cid="http://schemas.microsoft.com/office/word/2016/wordml/cid" xmlns:w16="http://schemas.microsoft.com/office/word/2018/wordml" xmlns:w16du="http://schemas.microsoft.com/office/word/2023/wordml/word16du" xmlns:w16sdtdh="http://schemas.microsoft.com/office/word/2020/wordml/sdtdatahash" xmlns:w16sdtfl="http://schemas.microsoft.com/office/word/2024/wordml/sdtformatlock" xmlns:w16se="http://schemas.microsoft.com/office/word/2015/wordml/symex" xmlns:wpg="http://schemas.microsoft.com/office/word/2010/wordprocessingGroup" xmlns:wpi="http://schemas.microsoft.com/office/word/2010/wordprocessingInk" xmlns:wne="http://schemas.microsoft.com/office/word/2006/wordml" xmlns:wps="http://schemas.microsoft.com/office/word/2010/wordprocessingShape" mc:Ignorable="w14 w15 w16se w16cid w16 w16cex w16sdtdh w16sdtfl w16du wp14">
-  <w16cid:commentId w16cid:paraId="6143D7D6" w16cid:durableId="2D3B6B7D"/>
-  <w16cid:commentId w16cid:paraId="2369FD69" w16cid:durableId="094B62E8"/>
-  <w16cid:commentId w16cid:paraId="3E4617F7" w16cid:durableId="732838DB"/>
-  <w16cid:commentId w16cid:paraId="09814BAC" w16cid:durableId="4CCB2853"/>
-</w16cid:commentsIds>
-</file>
-
-<file path=word/people.xml><?xml version="1.0" encoding="utf-8"?>
-<w15:people xmlns:wpc="http://schemas.microsoft.com/office/word/2010/wordprocessingCanvas" xmlns:cx="http://schemas.microsoft.com/office/drawing/2014/chartex" xmlns:cx1="http://schemas.microsoft.com/office/drawing/2015/9/8/chartex" xmlns:cx2="http://schemas.microsoft.com/office/drawing/2015/10/21/chartex" xmlns:cx3="http://schemas.microsoft.com/office/drawing/2016/5/9/chartex" xmlns:cx4="http://schemas.microsoft.com/office/drawing/2016/5/10/chartex" xmlns:cx5="http://schemas.microsoft.com/office/drawing/2016/5/11/chartex" xmlns:cx6="http://schemas.microsoft.com/office/drawing/2016/5/12/chartex" xmlns:cx7="http://schemas.microsoft.com/office/drawing/2016/5/13/chartex" xmlns:cx8="http://schemas.microsoft.com/office/drawing/2016/5/14/chartex" xmlns:mc="http://schemas.openxmlformats.org/markup-compatibility/2006" xmlns:aink="http://schemas.microsoft.com/office/drawing/2016/ink" xmlns:am3d="http://schemas.microsoft.com/office/drawing/2017/model3d" xmlns:o="urn:schemas-microsoft-com:office:office" xmlns:oel="http://schemas.microsoft.com/office/2019/extlst" xmlns:r="http://schemas.openxmlformats.org/officeDocument/2006/relationships" xmlns:m="http://schemas.openxmlformats.org/officeDocument/2006/math" xmlns:v="urn:schemas-microsoft-com:vml" xmlns:wp14="http://schemas.microsoft.com/office/word/2010/wordprocessingDrawing" xmlns:wp="http://schemas.openxmlformats.org/drawingml/2006/wordprocessingDrawing" xmlns:w10="urn:schemas-microsoft-com:office:word" xmlns:w="http://schemas.openxmlformats.org/wordprocessingml/2006/main" xmlns:w14="http://schemas.microsoft.com/office/word/2010/wordml" xmlns:w15="http://schemas.microsoft.com/office/word/2012/wordml" xmlns:w16cex="http://schemas.microsoft.com/office/word/2018/wordml/cex" xmlns:w16cid="http://schemas.microsoft.com/office/word/2016/wordml/cid" xmlns:w16="http://schemas.microsoft.com/office/word/2018/wordml" xmlns:w16du="http://schemas.microsoft.com/office/word/2023/wordml/word16du" xmlns:w16sdtdh="http://schemas.microsoft.com/office/word/2020/wordml/sdtdatahash" xmlns:w16sdtfl="http://schemas.microsoft.com/office/word/2024/wordml/sdtformatlock" xmlns:w16se="http://schemas.microsoft.com/office/word/2015/wordml/symex" xmlns:wpg="http://schemas.microsoft.com/office/word/2010/wordprocessingGroup" xmlns:wpi="http://schemas.microsoft.com/office/word/2010/wordprocessingInk" xmlns:wne="http://schemas.microsoft.com/office/word/2006/wordml" xmlns:wps="http://schemas.microsoft.com/office/word/2010/wordprocessingShape" mc:Ignorable="w14 w15 w16se w16cid w16 w16cex w16sdtdh w16sdtfl w16du wp14">
-  <w15:person w15:author="Coppinger, Brittany">
-    <w15:presenceInfo w15:providerId="AD" w15:userId="S::copping7@msu.edu::91362ca3-4f6d-449f-8348-5f9a1531276e"/>
-  </w15:person>
-</w15:people>
 </file>
 
 <file path=word/styles.xml><?xml version="1.0" encoding="utf-8"?>

</xml_diff>